<commit_message>
Entferne Ressourcen Block 5
</commit_message>
<xml_diff>
--- a/referent/Block-3-Selbststudium-Woche-5-OOP.docx
+++ b/referent/Block-3-Selbststudium-Woche-5-OOP.docx
@@ -1,6 +1,6 @@
 
 <file path=word/document.xml><?xml version="1.0" encoding="utf-8"?>
-<w:document xmlns:wpc="http://schemas.microsoft.com/office/word/2010/wordprocessingCanvas" xmlns:cx="http://schemas.microsoft.com/office/drawing/2014/chartex" xmlns:cx1="http://schemas.microsoft.com/office/drawing/2015/9/8/chartex" xmlns:cx2="http://schemas.microsoft.com/office/drawing/2015/10/21/chartex" xmlns:cx3="http://schemas.microsoft.com/office/drawing/2016/5/9/chartex" xmlns:cx4="http://schemas.microsoft.com/office/drawing/2016/5/10/chartex" xmlns:cx5="http://schemas.microsoft.com/office/drawing/2016/5/11/chartex" xmlns:cx6="http://schemas.microsoft.com/office/drawing/2016/5/12/chartex" xmlns:cx7="http://schemas.microsoft.com/office/drawing/2016/5/13/chartex" xmlns:cx8="http://schemas.microsoft.com/office/drawing/2016/5/14/chartex" xmlns:mc="http://schemas.openxmlformats.org/markup-compatibility/2006" xmlns:aink="http://schemas.microsoft.com/office/drawing/2016/ink" xmlns:am3d="http://schemas.microsoft.com/office/drawing/2017/model3d" xmlns:o="urn:schemas-microsoft-com:office:office" xmlns:oel="http://schemas.microsoft.com/office/2019/extlst" xmlns:r="http://schemas.openxmlformats.org/officeDocument/2006/relationships" xmlns:m="http://schemas.openxmlformats.org/officeDocument/2006/math" xmlns:v="urn:schemas-microsoft-com:vml" xmlns:wp14="http://schemas.microsoft.com/office/word/2010/wordprocessingDrawing" xmlns:wp="http://schemas.openxmlformats.org/drawingml/2006/wordprocessingDrawing" xmlns:w10="urn:schemas-microsoft-com:office:word" xmlns:w="http://schemas.openxmlformats.org/wordprocessingml/2006/main" xmlns:w14="http://schemas.microsoft.com/office/word/2010/wordml" xmlns:w15="http://schemas.microsoft.com/office/word/2012/wordml" xmlns:w16cex="http://schemas.microsoft.com/office/word/2018/wordml/cex" xmlns:w16cid="http://schemas.microsoft.com/office/word/2016/wordml/cid" xmlns:w16="http://schemas.microsoft.com/office/word/2018/wordml" xmlns:w16du="http://schemas.microsoft.com/office/word/2023/wordml/word16du" xmlns:w16sdtdh="http://schemas.microsoft.com/office/word/2020/wordml/sdtdatahash" xmlns:w16se="http://schemas.microsoft.com/office/word/2015/wordml/symex" xmlns:wpg="http://schemas.microsoft.com/office/word/2010/wordprocessingGroup" xmlns:wpi="http://schemas.microsoft.com/office/word/2010/wordprocessingInk" xmlns:wne="http://schemas.microsoft.com/office/word/2006/wordml" xmlns:wps="http://schemas.microsoft.com/office/word/2010/wordprocessingShape" mc:Ignorable="w14 w15 w16se w16cid w16 w16cex w16sdtdh w16du wp14">
+<w:document xmlns:wpc="http://schemas.microsoft.com/office/word/2010/wordprocessingCanvas" xmlns:cx="http://schemas.microsoft.com/office/drawing/2014/chartex" xmlns:cx1="http://schemas.microsoft.com/office/drawing/2015/9/8/chartex" xmlns:cx2="http://schemas.microsoft.com/office/drawing/2015/10/21/chartex" xmlns:cx3="http://schemas.microsoft.com/office/drawing/2016/5/9/chartex" xmlns:cx4="http://schemas.microsoft.com/office/drawing/2016/5/10/chartex" xmlns:cx5="http://schemas.microsoft.com/office/drawing/2016/5/11/chartex" xmlns:cx6="http://schemas.microsoft.com/office/drawing/2016/5/12/chartex" xmlns:cx7="http://schemas.microsoft.com/office/drawing/2016/5/13/chartex" xmlns:cx8="http://schemas.microsoft.com/office/drawing/2016/5/14/chartex" xmlns:mc="http://schemas.openxmlformats.org/markup-compatibility/2006" xmlns:aink="http://schemas.microsoft.com/office/drawing/2016/ink" xmlns:am3d="http://schemas.microsoft.com/office/drawing/2017/model3d" xmlns:o="urn:schemas-microsoft-com:office:office" xmlns:oel="http://schemas.microsoft.com/office/2019/extlst" xmlns:r="http://schemas.openxmlformats.org/officeDocument/2006/relationships" xmlns:m="http://schemas.openxmlformats.org/officeDocument/2006/math" xmlns:v="urn:schemas-microsoft-com:vml" xmlns:wp14="http://schemas.microsoft.com/office/word/2010/wordprocessingDrawing" xmlns:wp="http://schemas.openxmlformats.org/drawingml/2006/wordprocessingDrawing" xmlns:w10="urn:schemas-microsoft-com:office:word" xmlns:w="http://schemas.openxmlformats.org/wordprocessingml/2006/main" xmlns:w14="http://schemas.microsoft.com/office/word/2010/wordml" xmlns:w15="http://schemas.microsoft.com/office/word/2012/wordml" xmlns:w16cex="http://schemas.microsoft.com/office/word/2018/wordml/cex" xmlns:w16cid="http://schemas.microsoft.com/office/word/2016/wordml/cid" xmlns:w16="http://schemas.microsoft.com/office/word/2018/wordml" xmlns:w16du="http://schemas.microsoft.com/office/word/2023/wordml/word16du" xmlns:w16sdtdh="http://schemas.microsoft.com/office/word/2020/wordml/sdtdatahash" xmlns:w16sdtfl="http://schemas.microsoft.com/office/word/2024/wordml/sdtformatlock" xmlns:w16se="http://schemas.microsoft.com/office/word/2015/wordml/symex" xmlns:wpg="http://schemas.microsoft.com/office/word/2010/wordprocessingGroup" xmlns:wpi="http://schemas.microsoft.com/office/word/2010/wordprocessingInk" xmlns:wne="http://schemas.microsoft.com/office/word/2006/wordml" xmlns:wps="http://schemas.microsoft.com/office/word/2010/wordprocessingShape" mc:Ignorable="w14 w15 w16se w16cid w16 w16cex w16sdtdh w16sdtfl w16du wp14">
   <w:body>
     <w:p>
       <w:pPr>
@@ -1957,128 +1957,6 @@
           <w:lang w:val="en-US"/>
         </w:rPr>
       </w:pPr>
-      <w:r>
-        <w:rPr>
-          <w:lang w:val="en-US"/>
-        </w:rPr>
-        <w:br w:type="page"/>
-      </w:r>
-    </w:p>
-    <w:p>
-      <w:pPr>
-        <w:pStyle w:val="Heading1"/>
-      </w:pPr>
-      <w:r>
-        <w:lastRenderedPageBreak/>
-        <w:t>Ressourcen</w:t>
-      </w:r>
-    </w:p>
-    <w:p/>
-    <w:p>
-      <w:r>
-        <w:t>Hier nun die Verweise auf Lernquellen, die uns für diese Woche und ihre Inhalte geeignet erscheinen.</w:t>
-      </w:r>
-      <w:r>
-        <w:cr/>
-        <w:t>Je nachdem, welcher Lerntyp Sie sind, wählen Sie sich ihre bevorzugte Quelle, es ist nicht zwingend</w:t>
-      </w:r>
-      <w:r>
-        <w:cr/>
-        <w:t>notwendig alle durchgearbeitet zu haben. Allerdings sollten die Inhalte des Lernpfads angesprochen</w:t>
-      </w:r>
-      <w:r>
-        <w:t xml:space="preserve"> </w:t>
-      </w:r>
-      <w:r>
-        <w:t xml:space="preserve">und </w:t>
-      </w:r>
-      <w:r>
-        <w:t>v</w:t>
-      </w:r>
-      <w:r>
-        <w:t>erstanden worden sein.</w:t>
-      </w:r>
-    </w:p>
-    <w:p>
-      <w:pPr>
-        <w:pStyle w:val="ListParagraph"/>
-        <w:numPr>
-          <w:ilvl w:val="0"/>
-          <w:numId w:val="35"/>
-        </w:numPr>
-      </w:pPr>
-      <w:r>
-        <w:rPr>
-          <w:b/>
-          <w:bCs/>
-        </w:rPr>
-        <w:t>Buch</w:t>
-      </w:r>
-      <w:r>
-        <w:t>: Python Crash Course</w:t>
-      </w:r>
-    </w:p>
-    <w:p>
-      <w:pPr>
-        <w:ind w:firstLine="708"/>
-      </w:pPr>
-      <w:r>
-        <w:t>Klassen: Dieses Thema wird in "Kapitel 9: Klassen" behandelt.</w:t>
-      </w:r>
-    </w:p>
-    <w:p>
-      <w:pPr>
-        <w:pStyle w:val="ListParagraph"/>
-        <w:numPr>
-          <w:ilvl w:val="0"/>
-          <w:numId w:val="35"/>
-        </w:numPr>
-      </w:pPr>
-      <w:r>
-        <w:rPr>
-          <w:b/>
-          <w:bCs/>
-        </w:rPr>
-        <w:t>Video</w:t>
-      </w:r>
-      <w:r>
-        <w:t xml:space="preserve">: </w:t>
-      </w:r>
-    </w:p>
-    <w:p>
-      <w:pPr>
-        <w:ind w:firstLine="708"/>
-      </w:pPr>
-      <w:r>
-        <w:t>Codecademy: Learn Python 3 – Ein umfassender Kurs mit 27h Dauer</w:t>
-      </w:r>
-    </w:p>
-    <w:p>
-      <w:pPr>
-        <w:pStyle w:val="ListParagraph"/>
-        <w:numPr>
-          <w:ilvl w:val="0"/>
-          <w:numId w:val="35"/>
-        </w:numPr>
-      </w:pPr>
-      <w:r>
-        <w:rPr>
-          <w:b/>
-          <w:bCs/>
-        </w:rPr>
-        <w:t>Lab</w:t>
-      </w:r>
-      <w:r>
-        <w:t>:</w:t>
-      </w:r>
-    </w:p>
-    <w:p>
-      <w:pPr>
-        <w:ind w:left="12" w:firstLine="708"/>
-      </w:pPr>
-      <w:r>
-        <w:t>Python for Developers – Grundlegendes Python inklusive Datenstrukturen</w:t>
-      </w:r>
     </w:p>
     <w:sectPr>
       <w:pgSz w:w="11906" w:h="16838"/>
@@ -2091,7 +1969,7 @@
 </file>
 
 <file path=word/numbering.xml><?xml version="1.0" encoding="utf-8"?>
-<w:numbering xmlns:wpc="http://schemas.microsoft.com/office/word/2010/wordprocessingCanvas" xmlns:cx="http://schemas.microsoft.com/office/drawing/2014/chartex" xmlns:cx1="http://schemas.microsoft.com/office/drawing/2015/9/8/chartex" xmlns:cx2="http://schemas.microsoft.com/office/drawing/2015/10/21/chartex" xmlns:cx3="http://schemas.microsoft.com/office/drawing/2016/5/9/chartex" xmlns:cx4="http://schemas.microsoft.com/office/drawing/2016/5/10/chartex" xmlns:cx5="http://schemas.microsoft.com/office/drawing/2016/5/11/chartex" xmlns:cx6="http://schemas.microsoft.com/office/drawing/2016/5/12/chartex" xmlns:cx7="http://schemas.microsoft.com/office/drawing/2016/5/13/chartex" xmlns:cx8="http://schemas.microsoft.com/office/drawing/2016/5/14/chartex" xmlns:mc="http://schemas.openxmlformats.org/markup-compatibility/2006" xmlns:aink="http://schemas.microsoft.com/office/drawing/2016/ink" xmlns:am3d="http://schemas.microsoft.com/office/drawing/2017/model3d" xmlns:o="urn:schemas-microsoft-com:office:office" xmlns:oel="http://schemas.microsoft.com/office/2019/extlst" xmlns:r="http://schemas.openxmlformats.org/officeDocument/2006/relationships" xmlns:m="http://schemas.openxmlformats.org/officeDocument/2006/math" xmlns:v="urn:schemas-microsoft-com:vml" xmlns:wp14="http://schemas.microsoft.com/office/word/2010/wordprocessingDrawing" xmlns:wp="http://schemas.openxmlformats.org/drawingml/2006/wordprocessingDrawing" xmlns:w10="urn:schemas-microsoft-com:office:word" xmlns:w="http://schemas.openxmlformats.org/wordprocessingml/2006/main" xmlns:w14="http://schemas.microsoft.com/office/word/2010/wordml" xmlns:w15="http://schemas.microsoft.com/office/word/2012/wordml" xmlns:w16cex="http://schemas.microsoft.com/office/word/2018/wordml/cex" xmlns:w16cid="http://schemas.microsoft.com/office/word/2016/wordml/cid" xmlns:w16="http://schemas.microsoft.com/office/word/2018/wordml" xmlns:w16du="http://schemas.microsoft.com/office/word/2023/wordml/word16du" xmlns:w16sdtdh="http://schemas.microsoft.com/office/word/2020/wordml/sdtdatahash" xmlns:w16se="http://schemas.microsoft.com/office/word/2015/wordml/symex" xmlns:wpg="http://schemas.microsoft.com/office/word/2010/wordprocessingGroup" xmlns:wpi="http://schemas.microsoft.com/office/word/2010/wordprocessingInk" xmlns:wne="http://schemas.microsoft.com/office/word/2006/wordml" xmlns:wps="http://schemas.microsoft.com/office/word/2010/wordprocessingShape" mc:Ignorable="w14 w15 w16se w16cid w16 w16cex w16sdtdh w16du wp14">
+<w:numbering xmlns:wpc="http://schemas.microsoft.com/office/word/2010/wordprocessingCanvas" xmlns:cx="http://schemas.microsoft.com/office/drawing/2014/chartex" xmlns:cx1="http://schemas.microsoft.com/office/drawing/2015/9/8/chartex" xmlns:cx2="http://schemas.microsoft.com/office/drawing/2015/10/21/chartex" xmlns:cx3="http://schemas.microsoft.com/office/drawing/2016/5/9/chartex" xmlns:cx4="http://schemas.microsoft.com/office/drawing/2016/5/10/chartex" xmlns:cx5="http://schemas.microsoft.com/office/drawing/2016/5/11/chartex" xmlns:cx6="http://schemas.microsoft.com/office/drawing/2016/5/12/chartex" xmlns:cx7="http://schemas.microsoft.com/office/drawing/2016/5/13/chartex" xmlns:cx8="http://schemas.microsoft.com/office/drawing/2016/5/14/chartex" xmlns:mc="http://schemas.openxmlformats.org/markup-compatibility/2006" xmlns:aink="http://schemas.microsoft.com/office/drawing/2016/ink" xmlns:am3d="http://schemas.microsoft.com/office/drawing/2017/model3d" xmlns:o="urn:schemas-microsoft-com:office:office" xmlns:oel="http://schemas.microsoft.com/office/2019/extlst" xmlns:r="http://schemas.openxmlformats.org/officeDocument/2006/relationships" xmlns:m="http://schemas.openxmlformats.org/officeDocument/2006/math" xmlns:v="urn:schemas-microsoft-com:vml" xmlns:wp14="http://schemas.microsoft.com/office/word/2010/wordprocessingDrawing" xmlns:wp="http://schemas.openxmlformats.org/drawingml/2006/wordprocessingDrawing" xmlns:w10="urn:schemas-microsoft-com:office:word" xmlns:w="http://schemas.openxmlformats.org/wordprocessingml/2006/main" xmlns:w14="http://schemas.microsoft.com/office/word/2010/wordml" xmlns:w15="http://schemas.microsoft.com/office/word/2012/wordml" xmlns:w16cex="http://schemas.microsoft.com/office/word/2018/wordml/cex" xmlns:w16cid="http://schemas.microsoft.com/office/word/2016/wordml/cid" xmlns:w16="http://schemas.microsoft.com/office/word/2018/wordml" xmlns:w16du="http://schemas.microsoft.com/office/word/2023/wordml/word16du" xmlns:w16sdtdh="http://schemas.microsoft.com/office/word/2020/wordml/sdtdatahash" xmlns:w16sdtfl="http://schemas.microsoft.com/office/word/2024/wordml/sdtformatlock" xmlns:w16se="http://schemas.microsoft.com/office/word/2015/wordml/symex" xmlns:wpg="http://schemas.microsoft.com/office/word/2010/wordprocessingGroup" xmlns:wpi="http://schemas.microsoft.com/office/word/2010/wordprocessingInk" xmlns:wne="http://schemas.microsoft.com/office/word/2006/wordml" xmlns:wps="http://schemas.microsoft.com/office/word/2010/wordprocessingShape" mc:Ignorable="w14 w15 w16se w16cid w16 w16cex w16sdtdh w16sdtfl w16du wp14">
   <w:abstractNum w:abstractNumId="0" w15:restartNumberingAfterBreak="0">
     <w:nsid w:val="036F70CF"/>
     <w:multiLevelType w:val="hybridMultilevel"/>
@@ -5544,7 +5422,7 @@
 </file>
 
 <file path=word/styles.xml><?xml version="1.0" encoding="utf-8"?>
-<w:styles xmlns:mc="http://schemas.openxmlformats.org/markup-compatibility/2006" xmlns:r="http://schemas.openxmlformats.org/officeDocument/2006/relationships" xmlns:w="http://schemas.openxmlformats.org/wordprocessingml/2006/main" xmlns:w14="http://schemas.microsoft.com/office/word/2010/wordml" xmlns:w15="http://schemas.microsoft.com/office/word/2012/wordml" xmlns:w16cex="http://schemas.microsoft.com/office/word/2018/wordml/cex" xmlns:w16cid="http://schemas.microsoft.com/office/word/2016/wordml/cid" xmlns:w16="http://schemas.microsoft.com/office/word/2018/wordml" xmlns:w16du="http://schemas.microsoft.com/office/word/2023/wordml/word16du" xmlns:w16sdtdh="http://schemas.microsoft.com/office/word/2020/wordml/sdtdatahash" xmlns:w16se="http://schemas.microsoft.com/office/word/2015/wordml/symex" mc:Ignorable="w14 w15 w16se w16cid w16 w16cex w16sdtdh w16du">
+<w:styles xmlns:mc="http://schemas.openxmlformats.org/markup-compatibility/2006" xmlns:r="http://schemas.openxmlformats.org/officeDocument/2006/relationships" xmlns:w="http://schemas.openxmlformats.org/wordprocessingml/2006/main" xmlns:w14="http://schemas.microsoft.com/office/word/2010/wordml" xmlns:w15="http://schemas.microsoft.com/office/word/2012/wordml" xmlns:w16cex="http://schemas.microsoft.com/office/word/2018/wordml/cex" xmlns:w16cid="http://schemas.microsoft.com/office/word/2016/wordml/cid" xmlns:w16="http://schemas.microsoft.com/office/word/2018/wordml" xmlns:w16du="http://schemas.microsoft.com/office/word/2023/wordml/word16du" xmlns:w16sdtdh="http://schemas.microsoft.com/office/word/2020/wordml/sdtdatahash" xmlns:w16sdtfl="http://schemas.microsoft.com/office/word/2024/wordml/sdtformatlock" xmlns:w16se="http://schemas.microsoft.com/office/word/2015/wordml/symex" mc:Ignorable="w14 w15 w16se w16cid w16 w16cex w16sdtdh w16sdtfl w16du">
   <w:docDefaults>
     <w:rPrDefault>
       <w:rPr>

</xml_diff>